<commit_message>
adicionada a página de escalas
</commit_message>
<xml_diff>
--- a/modelos/Escalas.docx
+++ b/modelos/Escalas.docx
@@ -93,210 +93,236 @@
           <w:szCs w:val="20"/>
         </w:rPr>
       </w:pPr>
+      <w:r>
+        <w:rPr>
+          <w:sz w:val="20"/>
+          <w:szCs w:val="20"/>
+        </w:rPr>
+        <w:t>{% for bloco in blocos %}</w:t>
+      </w:r>
     </w:p>
     <w:p>
       <w:pPr>
         <w:rPr>
-          <w:sz w:val="20"/>
-          <w:szCs w:val="20"/>
-        </w:rPr>
-      </w:pPr>
-      <w:r>
-        <w:rPr>
           <w:b/>
           <w:bCs/>
-          <w:sz w:val="20"/>
-          <w:szCs w:val="20"/>
-        </w:rPr>
-        <w:t>Evento</w:t>
-      </w:r>
+          <w:sz w:val="24"/>
+        </w:rPr>
+      </w:pPr>
       <w:r>
         <w:rPr>
           <w:b/>
           <w:bCs/>
-          <w:sz w:val="20"/>
-          <w:szCs w:val="20"/>
+          <w:sz w:val="24"/>
+        </w:rPr>
+        <w:t>EVENTO</w:t>
+      </w:r>
+      <w:r>
+        <w:rPr>
+          <w:b/>
+          <w:bCs/>
+          <w:sz w:val="24"/>
         </w:rPr>
         <w:t>:</w:t>
       </w:r>
       <w:r>
         <w:rPr>
-          <w:sz w:val="20"/>
-          <w:szCs w:val="20"/>
-        </w:rPr>
-        <w:t xml:space="preserve"> {{</w:t>
-      </w:r>
-      <w:r>
-        <w:rPr>
-          <w:sz w:val="20"/>
-          <w:szCs w:val="20"/>
-        </w:rPr>
-        <w:t>nome</w:t>
-      </w:r>
-      <w:r>
-        <w:rPr>
-          <w:sz w:val="20"/>
-          <w:szCs w:val="20"/>
-        </w:rPr>
-        <w:t>}} – {{</w:t>
-      </w:r>
-      <w:r>
-        <w:rPr>
-          <w:sz w:val="20"/>
-          <w:szCs w:val="20"/>
-        </w:rPr>
-        <w:t>data</w:t>
-      </w:r>
-      <w:r>
-        <w:rPr>
-          <w:sz w:val="20"/>
-          <w:szCs w:val="20"/>
+          <w:b/>
+          <w:bCs/>
+          <w:sz w:val="24"/>
+        </w:rPr>
+        <w:t xml:space="preserve"> </w:t>
+      </w:r>
+      <w:r>
+        <w:rPr>
+          <w:sz w:val="24"/>
+        </w:rPr>
+        <w:t>{{</w:t>
+      </w:r>
+      <w:proofErr w:type="spellStart"/>
+      <w:proofErr w:type="gramStart"/>
+      <w:r>
+        <w:rPr>
+          <w:sz w:val="24"/>
+        </w:rPr>
+        <w:t>bloco.evento</w:t>
+      </w:r>
+      <w:proofErr w:type="gramEnd"/>
+      <w:r>
+        <w:rPr>
+          <w:sz w:val="24"/>
+        </w:rPr>
+        <w:t>|upper</w:t>
+      </w:r>
+      <w:proofErr w:type="spellEnd"/>
+      <w:r>
+        <w:rPr>
+          <w:sz w:val="24"/>
         </w:rPr>
         <w:t>}}</w:t>
       </w:r>
-      <w:r>
-        <w:rPr>
-          <w:sz w:val="20"/>
-          <w:szCs w:val="20"/>
-        </w:rPr>
-        <w:t xml:space="preserve"> – {{hora}}</w:t>
-      </w:r>
-    </w:p>
-    <w:p>
-      <w:pPr>
-        <w:rPr>
-          <w:sz w:val="20"/>
-          <w:szCs w:val="20"/>
-        </w:rPr>
-      </w:pPr>
     </w:p>
     <w:tbl>
       <w:tblPr>
         <w:tblStyle w:val="Tabelacomgrade"/>
-        <w:tblW w:w="0" w:type="auto"/>
+        <w:tblW w:w="10148" w:type="dxa"/>
+        <w:tblLayout w:type="fixed"/>
         <w:tblLook w:val="04A0" w:firstRow="1" w:lastRow="0" w:firstColumn="1" w:lastColumn="0" w:noHBand="0" w:noVBand="1"/>
       </w:tblPr>
       <w:tblGrid>
-        <w:gridCol w:w="3238"/>
-        <w:gridCol w:w="2033"/>
-        <w:gridCol w:w="2401"/>
-        <w:gridCol w:w="1275"/>
-        <w:gridCol w:w="1219"/>
+        <w:gridCol w:w="3912"/>
+        <w:gridCol w:w="1814"/>
+        <w:gridCol w:w="1474"/>
+        <w:gridCol w:w="1474"/>
+        <w:gridCol w:w="1474"/>
       </w:tblGrid>
       <w:tr>
+        <w:trPr>
+          <w:trHeight w:val="567"/>
+        </w:trPr>
         <w:tc>
           <w:tcPr>
-            <w:tcW w:w="3033" w:type="dxa"/>
+            <w:tcW w:w="3912" w:type="dxa"/>
+            <w:vAlign w:val="center"/>
           </w:tcPr>
           <w:p>
             <w:pPr>
               <w:jc w:val="center"/>
               <w:rPr>
+                <w:b/>
+                <w:bCs/>
                 <w:sz w:val="20"/>
                 <w:szCs w:val="20"/>
               </w:rPr>
             </w:pPr>
             <w:r>
               <w:rPr>
-                <w:sz w:val="20"/>
-                <w:szCs w:val="20"/>
-              </w:rPr>
-              <w:t>Nome</w:t>
+                <w:b/>
+                <w:bCs/>
+                <w:sz w:val="20"/>
+                <w:szCs w:val="20"/>
+              </w:rPr>
+              <w:t>NOME</w:t>
             </w:r>
           </w:p>
         </w:tc>
         <w:tc>
           <w:tcPr>
-            <w:tcW w:w="2033" w:type="dxa"/>
+            <w:tcW w:w="1814" w:type="dxa"/>
+            <w:vAlign w:val="center"/>
           </w:tcPr>
           <w:p>
             <w:pPr>
               <w:jc w:val="center"/>
               <w:rPr>
+                <w:b/>
+                <w:bCs/>
                 <w:sz w:val="20"/>
                 <w:szCs w:val="20"/>
               </w:rPr>
             </w:pPr>
             <w:r>
               <w:rPr>
-                <w:sz w:val="20"/>
-                <w:szCs w:val="20"/>
-              </w:rPr>
-              <w:t>Função</w:t>
+                <w:b/>
+                <w:bCs/>
+                <w:sz w:val="20"/>
+                <w:szCs w:val="20"/>
+              </w:rPr>
+              <w:t>FUNÇÃO</w:t>
             </w:r>
           </w:p>
         </w:tc>
         <w:tc>
           <w:tcPr>
-            <w:tcW w:w="2401" w:type="dxa"/>
+            <w:tcW w:w="1474" w:type="dxa"/>
+            <w:vAlign w:val="center"/>
           </w:tcPr>
           <w:p>
             <w:pPr>
               <w:jc w:val="center"/>
               <w:rPr>
+                <w:b/>
+                <w:bCs/>
                 <w:sz w:val="20"/>
                 <w:szCs w:val="20"/>
               </w:rPr>
             </w:pPr>
             <w:r>
               <w:rPr>
-                <w:sz w:val="20"/>
-                <w:szCs w:val="20"/>
-              </w:rPr>
-              <w:t>Pagamento</w:t>
+                <w:b/>
+                <w:bCs/>
+                <w:sz w:val="20"/>
+                <w:szCs w:val="20"/>
+              </w:rPr>
+              <w:t>PAGAMENTO</w:t>
             </w:r>
           </w:p>
         </w:tc>
         <w:tc>
           <w:tcPr>
-            <w:tcW w:w="1374" w:type="dxa"/>
+            <w:tcW w:w="1474" w:type="dxa"/>
+            <w:vAlign w:val="center"/>
           </w:tcPr>
           <w:p>
             <w:pPr>
               <w:jc w:val="center"/>
               <w:rPr>
+                <w:b/>
+                <w:bCs/>
                 <w:sz w:val="20"/>
                 <w:szCs w:val="20"/>
               </w:rPr>
             </w:pPr>
             <w:r>
               <w:rPr>
-                <w:sz w:val="20"/>
-                <w:szCs w:val="20"/>
-              </w:rPr>
-              <w:t>Horas extras</w:t>
+                <w:b/>
+                <w:bCs/>
+                <w:sz w:val="20"/>
+                <w:szCs w:val="20"/>
+              </w:rPr>
+              <w:t>HORAS EXTRAS</w:t>
             </w:r>
           </w:p>
         </w:tc>
         <w:tc>
           <w:tcPr>
-            <w:tcW w:w="1325" w:type="dxa"/>
+            <w:tcW w:w="1474" w:type="dxa"/>
+            <w:vAlign w:val="center"/>
           </w:tcPr>
           <w:p>
             <w:pPr>
               <w:jc w:val="center"/>
               <w:rPr>
+                <w:b/>
+                <w:bCs/>
                 <w:sz w:val="20"/>
                 <w:szCs w:val="20"/>
               </w:rPr>
             </w:pPr>
             <w:r>
               <w:rPr>
-                <w:sz w:val="20"/>
-                <w:szCs w:val="20"/>
-              </w:rPr>
-              <w:t>Total</w:t>
+                <w:b/>
+                <w:bCs/>
+                <w:sz w:val="20"/>
+                <w:szCs w:val="20"/>
+              </w:rPr>
+              <w:t>TOTAL</w:t>
             </w:r>
           </w:p>
         </w:tc>
       </w:tr>
       <w:tr>
+        <w:trPr>
+          <w:trHeight w:val="567"/>
+        </w:trPr>
         <w:tc>
           <w:tcPr>
-            <w:tcW w:w="3033" w:type="dxa"/>
+            <w:tcW w:w="3912" w:type="dxa"/>
+            <w:vAlign w:val="center"/>
           </w:tcPr>
           <w:p>
             <w:pPr>
+              <w:jc w:val="center"/>
               <w:rPr>
                 <w:sz w:val="20"/>
                 <w:szCs w:val="20"/>
@@ -307,36 +333,60 @@
                 <w:sz w:val="20"/>
                 <w:szCs w:val="20"/>
               </w:rPr>
-              <w:t>{% for colaborador in colaboradores %}</w:t>
-            </w:r>
-            <w:r>
-              <w:rPr>
-                <w:sz w:val="20"/>
-                <w:szCs w:val="20"/>
-              </w:rPr>
-              <w:t>{{</w:t>
-            </w:r>
-            <w:r>
-              <w:rPr>
-                <w:sz w:val="20"/>
-                <w:szCs w:val="20"/>
-              </w:rPr>
-              <w:t>colaborador</w:t>
-            </w:r>
-            <w:r>
-              <w:rPr>
-                <w:sz w:val="20"/>
-                <w:szCs w:val="20"/>
-              </w:rPr>
-              <w:t>.</w:t>
-            </w:r>
-            <w:r>
-              <w:rPr>
-                <w:sz w:val="20"/>
-                <w:szCs w:val="20"/>
-              </w:rPr>
-              <w:t>nome_colaborador</w:t>
-            </w:r>
+              <w:t xml:space="preserve">{% for colaborador in </w:t>
+            </w:r>
+            <w:proofErr w:type="spellStart"/>
+            <w:proofErr w:type="gramStart"/>
+            <w:r>
+              <w:rPr>
+                <w:sz w:val="20"/>
+                <w:szCs w:val="20"/>
+              </w:rPr>
+              <w:t>bloco.colaboradores</w:t>
+            </w:r>
+            <w:proofErr w:type="spellEnd"/>
+            <w:proofErr w:type="gramEnd"/>
+            <w:r>
+              <w:rPr>
+                <w:sz w:val="20"/>
+                <w:szCs w:val="20"/>
+              </w:rPr>
+              <w:t xml:space="preserve"> </w:t>
+            </w:r>
+            <w:proofErr w:type="gramStart"/>
+            <w:r>
+              <w:rPr>
+                <w:sz w:val="20"/>
+                <w:szCs w:val="20"/>
+              </w:rPr>
+              <w:t>%}{</w:t>
+            </w:r>
+            <w:proofErr w:type="gramEnd"/>
+            <w:r>
+              <w:rPr>
+                <w:sz w:val="20"/>
+                <w:szCs w:val="20"/>
+              </w:rPr>
+              <w:t>{</w:t>
+            </w:r>
+            <w:proofErr w:type="spellStart"/>
+            <w:proofErr w:type="gramStart"/>
+            <w:r>
+              <w:rPr>
+                <w:sz w:val="20"/>
+                <w:szCs w:val="20"/>
+              </w:rPr>
+              <w:t>colaborador.nome</w:t>
+            </w:r>
+            <w:proofErr w:type="gramEnd"/>
+            <w:r>
+              <w:rPr>
+                <w:sz w:val="20"/>
+                <w:szCs w:val="20"/>
+              </w:rPr>
+              <w:t>_colaborador</w:t>
+            </w:r>
+            <w:proofErr w:type="spellEnd"/>
             <w:r>
               <w:rPr>
                 <w:sz w:val="20"/>
@@ -348,10 +398,12 @@
         </w:tc>
         <w:tc>
           <w:tcPr>
-            <w:tcW w:w="2033" w:type="dxa"/>
+            <w:tcW w:w="1814" w:type="dxa"/>
+            <w:vAlign w:val="center"/>
           </w:tcPr>
           <w:p>
             <w:pPr>
+              <w:jc w:val="center"/>
               <w:rPr>
                 <w:sz w:val="20"/>
                 <w:szCs w:val="20"/>
@@ -364,49 +416,34 @@
               </w:rPr>
               <w:t>{{</w:t>
             </w:r>
-            <w:r>
-              <w:rPr>
-                <w:sz w:val="20"/>
-                <w:szCs w:val="20"/>
-              </w:rPr>
-              <w:t>colaborador</w:t>
-            </w:r>
-            <w:r>
-              <w:rPr>
-                <w:sz w:val="20"/>
-                <w:szCs w:val="20"/>
-              </w:rPr>
-              <w:t>.</w:t>
-            </w:r>
-            <w:r>
-              <w:rPr>
-                <w:sz w:val="20"/>
-                <w:szCs w:val="20"/>
-              </w:rPr>
-              <w:t>fun</w:t>
-            </w:r>
-            <w:r>
-              <w:rPr>
-                <w:sz w:val="20"/>
-                <w:szCs w:val="20"/>
-              </w:rPr>
-              <w:t>ca</w:t>
-            </w:r>
-            <w:r>
-              <w:rPr>
-                <w:sz w:val="20"/>
-                <w:szCs w:val="20"/>
-              </w:rPr>
-              <w:t>o}}</w:t>
+            <w:proofErr w:type="spellStart"/>
+            <w:proofErr w:type="gramStart"/>
+            <w:r>
+              <w:rPr>
+                <w:sz w:val="20"/>
+                <w:szCs w:val="20"/>
+              </w:rPr>
+              <w:t>colaborador.CATEGORIA</w:t>
+            </w:r>
+            <w:proofErr w:type="spellEnd"/>
+            <w:proofErr w:type="gramEnd"/>
+            <w:r>
+              <w:rPr>
+                <w:sz w:val="20"/>
+                <w:szCs w:val="20"/>
+              </w:rPr>
+              <w:t>}}</w:t>
             </w:r>
           </w:p>
         </w:tc>
         <w:tc>
           <w:tcPr>
-            <w:tcW w:w="2401" w:type="dxa"/>
+            <w:tcW w:w="1474" w:type="dxa"/>
+            <w:vAlign w:val="center"/>
           </w:tcPr>
           <w:p>
             <w:pPr>
+              <w:jc w:val="center"/>
               <w:rPr>
                 <w:sz w:val="20"/>
                 <w:szCs w:val="20"/>
@@ -419,27 +456,17 @@
               </w:rPr>
               <w:t>{{</w:t>
             </w:r>
-            <w:r>
-              <w:rPr>
-                <w:sz w:val="20"/>
-                <w:szCs w:val="20"/>
-              </w:rPr>
-              <w:t>colaborador</w:t>
-            </w:r>
-            <w:r>
-              <w:rPr>
-                <w:sz w:val="20"/>
-                <w:szCs w:val="20"/>
-              </w:rPr>
-              <w:t>.</w:t>
-            </w:r>
-            <w:r>
-              <w:rPr>
-                <w:sz w:val="20"/>
-                <w:szCs w:val="20"/>
-              </w:rPr>
-              <w:t>pagamento</w:t>
-            </w:r>
+            <w:proofErr w:type="spellStart"/>
+            <w:proofErr w:type="gramStart"/>
+            <w:r>
+              <w:rPr>
+                <w:sz w:val="20"/>
+                <w:szCs w:val="20"/>
+              </w:rPr>
+              <w:t>colaborador.VALOR</w:t>
+            </w:r>
+            <w:proofErr w:type="spellEnd"/>
+            <w:proofErr w:type="gramEnd"/>
             <w:r>
               <w:rPr>
                 <w:sz w:val="20"/>
@@ -451,10 +478,12 @@
         </w:tc>
         <w:tc>
           <w:tcPr>
-            <w:tcW w:w="1374" w:type="dxa"/>
+            <w:tcW w:w="1474" w:type="dxa"/>
+            <w:vAlign w:val="center"/>
           </w:tcPr>
           <w:p>
             <w:pPr>
+              <w:jc w:val="center"/>
               <w:rPr>
                 <w:sz w:val="20"/>
                 <w:szCs w:val="20"/>
@@ -464,13 +493,120 @@
         </w:tc>
         <w:tc>
           <w:tcPr>
-            <w:tcW w:w="1325" w:type="dxa"/>
+            <w:tcW w:w="1474" w:type="dxa"/>
+            <w:vAlign w:val="center"/>
           </w:tcPr>
           <w:p>
             <w:pPr>
-              <w:rPr>
-                <w:sz w:val="20"/>
-                <w:szCs w:val="20"/>
+              <w:jc w:val="center"/>
+              <w:rPr>
+                <w:sz w:val="20"/>
+                <w:szCs w:val="20"/>
+                <w:u w:val="single"/>
+              </w:rPr>
+            </w:pPr>
+          </w:p>
+        </w:tc>
+      </w:tr>
+      <w:tr>
+        <w:trPr>
+          <w:trHeight w:val="567"/>
+        </w:trPr>
+        <w:tc>
+          <w:tcPr>
+            <w:tcW w:w="3912" w:type="dxa"/>
+            <w:vAlign w:val="center"/>
+          </w:tcPr>
+          <w:p>
+            <w:pPr>
+              <w:jc w:val="center"/>
+              <w:rPr>
+                <w:sz w:val="20"/>
+                <w:szCs w:val="20"/>
+              </w:rPr>
+            </w:pPr>
+            <w:r>
+              <w:rPr>
+                <w:sz w:val="20"/>
+                <w:szCs w:val="20"/>
+              </w:rPr>
+              <w:t xml:space="preserve">{% </w:t>
+            </w:r>
+            <w:proofErr w:type="spellStart"/>
+            <w:r>
+              <w:rPr>
+                <w:sz w:val="20"/>
+                <w:szCs w:val="20"/>
+              </w:rPr>
+              <w:t>endfor</w:t>
+            </w:r>
+            <w:proofErr w:type="spellEnd"/>
+            <w:r>
+              <w:rPr>
+                <w:sz w:val="20"/>
+                <w:szCs w:val="20"/>
+              </w:rPr>
+              <w:t xml:space="preserve"> %}</w:t>
+            </w:r>
+          </w:p>
+        </w:tc>
+        <w:tc>
+          <w:tcPr>
+            <w:tcW w:w="1814" w:type="dxa"/>
+            <w:vAlign w:val="center"/>
+          </w:tcPr>
+          <w:p>
+            <w:pPr>
+              <w:jc w:val="center"/>
+              <w:rPr>
+                <w:sz w:val="20"/>
+                <w:szCs w:val="20"/>
+              </w:rPr>
+            </w:pPr>
+          </w:p>
+        </w:tc>
+        <w:tc>
+          <w:tcPr>
+            <w:tcW w:w="1474" w:type="dxa"/>
+            <w:vAlign w:val="center"/>
+          </w:tcPr>
+          <w:p>
+            <w:pPr>
+              <w:jc w:val="center"/>
+              <w:rPr>
+                <w:sz w:val="20"/>
+                <w:szCs w:val="20"/>
+              </w:rPr>
+            </w:pPr>
+          </w:p>
+        </w:tc>
+        <w:tc>
+          <w:tcPr>
+            <w:tcW w:w="1474" w:type="dxa"/>
+            <w:vAlign w:val="center"/>
+          </w:tcPr>
+          <w:p>
+            <w:pPr>
+              <w:jc w:val="center"/>
+              <w:rPr>
+                <w:sz w:val="20"/>
+                <w:szCs w:val="20"/>
+              </w:rPr>
+            </w:pPr>
+          </w:p>
+        </w:tc>
+        <w:tc>
+          <w:tcPr>
+            <w:tcW w:w="1474" w:type="dxa"/>
+            <w:vAlign w:val="center"/>
+          </w:tcPr>
+          <w:p>
+            <w:pPr>
+              <w:jc w:val="center"/>
+              <w:rPr>
+                <w:sz w:val="20"/>
+                <w:szCs w:val="20"/>
+                <w:u w:val="single"/>
               </w:rPr>
             </w:pPr>
           </w:p>
@@ -482,6 +618,7 @@
         <w:rPr>
           <w:sz w:val="20"/>
           <w:szCs w:val="20"/>
+          <w:u w:val="single"/>
         </w:rPr>
       </w:pPr>
       <w:r>
@@ -489,7 +626,120 @@
           <w:sz w:val="20"/>
           <w:szCs w:val="20"/>
         </w:rPr>
-        <w:t>{% endfor %}</w:t>
+        <w:t xml:space="preserve">{% </w:t>
+      </w:r>
+      <w:proofErr w:type="spellStart"/>
+      <w:r>
+        <w:rPr>
+          <w:sz w:val="20"/>
+          <w:szCs w:val="20"/>
+        </w:rPr>
+        <w:t>if</w:t>
+      </w:r>
+      <w:proofErr w:type="spellEnd"/>
+      <w:r>
+        <w:rPr>
+          <w:sz w:val="20"/>
+          <w:szCs w:val="20"/>
+        </w:rPr>
+        <w:t xml:space="preserve"> </w:t>
+      </w:r>
+      <w:proofErr w:type="spellStart"/>
+      <w:r>
+        <w:rPr>
+          <w:sz w:val="20"/>
+          <w:szCs w:val="20"/>
+        </w:rPr>
+        <w:t>not</w:t>
+      </w:r>
+      <w:proofErr w:type="spellEnd"/>
+      <w:r>
+        <w:rPr>
+          <w:sz w:val="20"/>
+          <w:szCs w:val="20"/>
+        </w:rPr>
+        <w:t xml:space="preserve"> </w:t>
+      </w:r>
+      <w:proofErr w:type="spellStart"/>
+      <w:proofErr w:type="gramStart"/>
+      <w:r>
+        <w:rPr>
+          <w:sz w:val="20"/>
+          <w:szCs w:val="20"/>
+        </w:rPr>
+        <w:t>loop.last</w:t>
+      </w:r>
+      <w:proofErr w:type="spellEnd"/>
+      <w:proofErr w:type="gramEnd"/>
+      <w:r>
+        <w:rPr>
+          <w:sz w:val="20"/>
+          <w:szCs w:val="20"/>
+        </w:rPr>
+        <w:t xml:space="preserve"> %}</w:t>
+      </w:r>
+    </w:p>
+    <w:p>
+      <w:pPr>
+        <w:rPr>
+          <w:sz w:val="20"/>
+          <w:szCs w:val="20"/>
+        </w:rPr>
+      </w:pPr>
+      <w:r>
+        <w:rPr>
+          <w:sz w:val="20"/>
+          <w:szCs w:val="20"/>
+        </w:rPr>
+        <w:t xml:space="preserve">{% </w:t>
+      </w:r>
+      <w:proofErr w:type="spellStart"/>
+      <w:r>
+        <w:rPr>
+          <w:sz w:val="20"/>
+          <w:szCs w:val="20"/>
+        </w:rPr>
+        <w:t>endif</w:t>
+      </w:r>
+      <w:proofErr w:type="spellEnd"/>
+      <w:r>
+        <w:rPr>
+          <w:sz w:val="20"/>
+          <w:szCs w:val="20"/>
+        </w:rPr>
+        <w:t xml:space="preserve"> %}</w:t>
+      </w:r>
+    </w:p>
+    <w:p>
+      <w:pPr>
+        <w:rPr>
+          <w:sz w:val="20"/>
+          <w:szCs w:val="20"/>
+          <w:u w:val="single"/>
+        </w:rPr>
+      </w:pPr>
+      <w:r>
+        <w:rPr>
+          <w:sz w:val="20"/>
+          <w:szCs w:val="20"/>
+        </w:rPr>
+        <w:t xml:space="preserve">{% </w:t>
+      </w:r>
+      <w:proofErr w:type="spellStart"/>
+      <w:r>
+        <w:rPr>
+          <w:sz w:val="20"/>
+          <w:szCs w:val="20"/>
+        </w:rPr>
+        <w:t>endfor</w:t>
+      </w:r>
+      <w:proofErr w:type="spellEnd"/>
+      <w:r>
+        <w:rPr>
+          <w:sz w:val="20"/>
+          <w:szCs w:val="20"/>
+        </w:rPr>
+        <w:t xml:space="preserve"> %}</w:t>
       </w:r>
     </w:p>
     <w:sectPr>

</xml_diff>